<commit_message>
feat: harden analysis lifecycle and learning workflows
</commit_message>
<xml_diff>
--- a/output/project-status/RepoWiseAI_프로젝트_진행_상황_보고서.docx
+++ b/output/project-status/RepoWiseAI_프로젝트_진행_상황_보고서.docx
@@ -178,7 +178,24 @@
           <w:sz w:val="21"/>
           <w:lang w:eastAsia="ko-KR"/>
         </w:rPr>
-        <w:t>2026년 8월 4일</w:t>
+        <w:t>2026년 8월</w:t>
+      </w:r>
+      <w:r>
+        <w:rPr>
+          <w:rFonts w:hint="eastAsia"/>
+          <w:color w:val="333333"/>
+          <w:sz w:val="21"/>
+          <w:lang w:eastAsia="ko-KR"/>
+        </w:rPr>
+        <w:t>9</w:t>
+      </w:r>
+      <w:r>
+        <w:rPr>
+          <w:color w:val="333333"/>
+          <w:sz w:val="21"/>
+          <w:lang w:eastAsia="ko-KR"/>
+        </w:rPr>
+        <w:t>일</w:t>
       </w:r>
     </w:p>
     <w:p>
@@ -229,31 +246,6 @@
           <w:lang w:eastAsia="ko-KR"/>
         </w:rPr>
         <w:t>github.com/leeseungmin1013/RepoWiseAI</w:t>
-      </w:r>
-    </w:p>
-    <w:p>
-      <w:pPr>
-        <w:spacing w:after="80"/>
-        <w:rPr>
-          <w:lang w:eastAsia="ko-KR"/>
-        </w:rPr>
-      </w:pPr>
-      <w:r>
-        <w:rPr>
-          <w:b/>
-          <w:color w:val="0B2545"/>
-          <w:sz w:val="21"/>
-          <w:lang w:eastAsia="ko-KR"/>
-        </w:rPr>
-        <w:t xml:space="preserve">문서 대상: </w:t>
-      </w:r>
-      <w:r>
-        <w:rPr>
-          <w:color w:val="333333"/>
-          <w:sz w:val="21"/>
-          <w:lang w:eastAsia="ko-KR"/>
-        </w:rPr>
-        <w:t>프로젝트를 처음 접하는 비전공자</w:t>
       </w:r>
     </w:p>
     <w:p>
@@ -666,12 +658,14 @@
               <w:spacing w:after="0"/>
               <w:jc w:val="center"/>
             </w:pPr>
+            <w:proofErr w:type="spellStart"/>
             <w:r>
               <w:rPr>
                 <w:sz w:val="18"/>
               </w:rPr>
               <w:t>개발자</w:t>
             </w:r>
+            <w:proofErr w:type="spellEnd"/>
           </w:p>
         </w:tc>
         <w:tc>
@@ -1027,12 +1021,28 @@
               <w:spacing w:after="0"/>
               <w:jc w:val="center"/>
             </w:pPr>
+            <w:proofErr w:type="spellStart"/>
             <w:r>
               <w:rPr>
                 <w:sz w:val="18"/>
               </w:rPr>
-              <w:t>구조·기능 탐색</w:t>
+              <w:t>구조·기능</w:t>
             </w:r>
+            <w:proofErr w:type="spellEnd"/>
+            <w:r>
+              <w:rPr>
+                <w:sz w:val="18"/>
+              </w:rPr>
+              <w:t xml:space="preserve"> </w:t>
+            </w:r>
+            <w:proofErr w:type="spellStart"/>
+            <w:r>
+              <w:rPr>
+                <w:sz w:val="18"/>
+              </w:rPr>
+              <w:t>탐색</w:t>
+            </w:r>
+            <w:proofErr w:type="spellEnd"/>
           </w:p>
         </w:tc>
         <w:tc>
@@ -1085,12 +1095,28 @@
               <w:spacing w:after="0"/>
               <w:jc w:val="center"/>
             </w:pPr>
+            <w:proofErr w:type="spellStart"/>
             <w:r>
               <w:rPr>
                 <w:sz w:val="18"/>
               </w:rPr>
-              <w:t>질문·변경 영향</w:t>
+              <w:t>질문·변경</w:t>
             </w:r>
+            <w:proofErr w:type="spellEnd"/>
+            <w:r>
+              <w:rPr>
+                <w:sz w:val="18"/>
+              </w:rPr>
+              <w:t xml:space="preserve"> </w:t>
+            </w:r>
+            <w:proofErr w:type="spellStart"/>
+            <w:r>
+              <w:rPr>
+                <w:sz w:val="18"/>
+              </w:rPr>
+              <w:t>영향</w:t>
+            </w:r>
+            <w:proofErr w:type="spellEnd"/>
           </w:p>
         </w:tc>
         <w:tc>
@@ -1143,12 +1169,28 @@
               <w:spacing w:after="0"/>
               <w:jc w:val="center"/>
             </w:pPr>
+            <w:proofErr w:type="spellStart"/>
             <w:r>
               <w:rPr>
                 <w:sz w:val="18"/>
               </w:rPr>
-              <w:t>적응형 학습</w:t>
+              <w:t>적응형</w:t>
             </w:r>
+            <w:proofErr w:type="spellEnd"/>
+            <w:r>
+              <w:rPr>
+                <w:sz w:val="18"/>
+              </w:rPr>
+              <w:t xml:space="preserve"> </w:t>
+            </w:r>
+            <w:proofErr w:type="spellStart"/>
+            <w:r>
+              <w:rPr>
+                <w:sz w:val="18"/>
+              </w:rPr>
+              <w:t>학습</w:t>
+            </w:r>
+            <w:proofErr w:type="spellEnd"/>
           </w:p>
         </w:tc>
         <w:tc>
@@ -1201,12 +1243,28 @@
               <w:spacing w:after="0"/>
               <w:jc w:val="center"/>
             </w:pPr>
+            <w:proofErr w:type="spellStart"/>
             <w:r>
               <w:rPr>
                 <w:sz w:val="18"/>
               </w:rPr>
-              <w:t>음성·공식 자료</w:t>
+              <w:t>음성·공식</w:t>
             </w:r>
+            <w:proofErr w:type="spellEnd"/>
+            <w:r>
+              <w:rPr>
+                <w:sz w:val="18"/>
+              </w:rPr>
+              <w:t xml:space="preserve"> </w:t>
+            </w:r>
+            <w:proofErr w:type="spellStart"/>
+            <w:r>
+              <w:rPr>
+                <w:sz w:val="18"/>
+              </w:rPr>
+              <w:t>자료</w:t>
+            </w:r>
+            <w:proofErr w:type="spellEnd"/>
           </w:p>
         </w:tc>
         <w:tc>
@@ -1259,12 +1317,14 @@
               <w:spacing w:after="0"/>
               <w:jc w:val="center"/>
             </w:pPr>
+            <w:proofErr w:type="spellStart"/>
             <w:r>
               <w:rPr>
                 <w:sz w:val="18"/>
               </w:rPr>
               <w:t>인증·배포</w:t>
             </w:r>
+            <w:proofErr w:type="spellEnd"/>
           </w:p>
         </w:tc>
         <w:tc>
@@ -3338,7 +3398,21 @@
               <w:rPr>
                 <w:sz w:val="18"/>
               </w:rPr>
-              <w:t>Project Map·Feature Flow</w:t>
+              <w:t xml:space="preserve">Project </w:t>
+            </w:r>
+            <w:proofErr w:type="spellStart"/>
+            <w:r>
+              <w:rPr>
+                <w:sz w:val="18"/>
+              </w:rPr>
+              <w:t>Map·Feature</w:t>
+            </w:r>
+            <w:proofErr w:type="spellEnd"/>
+            <w:r>
+              <w:rPr>
+                <w:sz w:val="18"/>
+              </w:rPr>
+              <w:t xml:space="preserve"> Flow</w:t>
             </w:r>
           </w:p>
         </w:tc>
@@ -3396,7 +3470,21 @@
               <w:rPr>
                 <w:sz w:val="18"/>
               </w:rPr>
-              <w:t>Code Focus·Change Brief</w:t>
+              <w:t xml:space="preserve">Code </w:t>
+            </w:r>
+            <w:proofErr w:type="spellStart"/>
+            <w:r>
+              <w:rPr>
+                <w:sz w:val="18"/>
+              </w:rPr>
+              <w:t>Focus·Change</w:t>
+            </w:r>
+            <w:proofErr w:type="spellEnd"/>
+            <w:r>
+              <w:rPr>
+                <w:sz w:val="18"/>
+              </w:rPr>
+              <w:t xml:space="preserve"> Brief</w:t>
             </w:r>
           </w:p>
         </w:tc>
@@ -3508,12 +3596,14 @@
               <w:spacing w:after="0"/>
               <w:jc w:val="center"/>
             </w:pPr>
+            <w:proofErr w:type="spellStart"/>
             <w:r>
               <w:rPr>
                 <w:sz w:val="18"/>
               </w:rPr>
               <w:t>DeepTask</w:t>
             </w:r>
+            <w:proofErr w:type="spellEnd"/>
           </w:p>
         </w:tc>
         <w:tc>
@@ -3566,12 +3656,28 @@
               <w:spacing w:after="0"/>
               <w:jc w:val="center"/>
             </w:pPr>
+            <w:proofErr w:type="spellStart"/>
             <w:r>
               <w:rPr>
                 <w:sz w:val="18"/>
               </w:rPr>
-              <w:t>실시간 음성</w:t>
+              <w:t>실시간</w:t>
             </w:r>
+            <w:proofErr w:type="spellEnd"/>
+            <w:r>
+              <w:rPr>
+                <w:sz w:val="18"/>
+              </w:rPr>
+              <w:t xml:space="preserve"> </w:t>
+            </w:r>
+            <w:proofErr w:type="spellStart"/>
+            <w:r>
+              <w:rPr>
+                <w:sz w:val="18"/>
+              </w:rPr>
+              <w:t>음성</w:t>
+            </w:r>
+            <w:proofErr w:type="spellEnd"/>
           </w:p>
         </w:tc>
         <w:tc>
@@ -3624,12 +3730,28 @@
               <w:spacing w:after="0"/>
               <w:jc w:val="center"/>
             </w:pPr>
+            <w:proofErr w:type="spellStart"/>
             <w:r>
               <w:rPr>
                 <w:sz w:val="18"/>
               </w:rPr>
-              <w:t>공식 학습자료</w:t>
+              <w:t>공식</w:t>
             </w:r>
+            <w:proofErr w:type="spellEnd"/>
+            <w:r>
+              <w:rPr>
+                <w:sz w:val="18"/>
+              </w:rPr>
+              <w:t xml:space="preserve"> </w:t>
+            </w:r>
+            <w:proofErr w:type="spellStart"/>
+            <w:r>
+              <w:rPr>
+                <w:sz w:val="18"/>
+              </w:rPr>
+              <w:t>학습자료</w:t>
+            </w:r>
+            <w:proofErr w:type="spellEnd"/>
           </w:p>
         </w:tc>
         <w:tc>
@@ -3682,12 +3804,28 @@
               <w:spacing w:after="0"/>
               <w:jc w:val="center"/>
             </w:pPr>
+            <w:proofErr w:type="spellStart"/>
             <w:r>
               <w:rPr>
                 <w:sz w:val="18"/>
               </w:rPr>
-              <w:t>품질 평가</w:t>
+              <w:t>품질</w:t>
             </w:r>
+            <w:proofErr w:type="spellEnd"/>
+            <w:r>
+              <w:rPr>
+                <w:sz w:val="18"/>
+              </w:rPr>
+              <w:t xml:space="preserve"> </w:t>
+            </w:r>
+            <w:proofErr w:type="spellStart"/>
+            <w:r>
+              <w:rPr>
+                <w:sz w:val="18"/>
+              </w:rPr>
+              <w:t>평가</w:t>
+            </w:r>
+            <w:proofErr w:type="spellEnd"/>
           </w:p>
         </w:tc>
         <w:tc>
@@ -4626,13 +4764,41 @@
         <w:lang w:eastAsia="ko-KR"/>
       </w:rPr>
     </w:pPr>
+    <w:proofErr w:type="spellStart"/>
     <w:r>
       <w:rPr>
         <w:color w:val="5B6573"/>
         <w:sz w:val="17"/>
         <w:lang w:eastAsia="ko-KR"/>
       </w:rPr>
-      <w:t>RepoWise AI  |  프로젝트 진행 상황 보고서</w:t>
+      <w:t>RepoWise</w:t>
+    </w:r>
+    <w:proofErr w:type="spellEnd"/>
+    <w:r>
+      <w:rPr>
+        <w:color w:val="5B6573"/>
+        <w:sz w:val="17"/>
+        <w:lang w:eastAsia="ko-KR"/>
+      </w:rPr>
+      <w:t xml:space="preserve"> </w:t>
+    </w:r>
+    <w:proofErr w:type="gramStart"/>
+    <w:r>
+      <w:rPr>
+        <w:color w:val="5B6573"/>
+        <w:sz w:val="17"/>
+        <w:lang w:eastAsia="ko-KR"/>
+      </w:rPr>
+      <w:t>AI  |</w:t>
+    </w:r>
+    <w:proofErr w:type="gramEnd"/>
+    <w:r>
+      <w:rPr>
+        <w:color w:val="5B6573"/>
+        <w:sz w:val="17"/>
+        <w:lang w:eastAsia="ko-KR"/>
+      </w:rPr>
+      <w:t xml:space="preserve">  프로젝트 진행 상황 보고서</w:t>
     </w:r>
   </w:p>
 </w:hdr>

</xml_diff>